<commit_message>
added the managed migration row
</commit_message>
<xml_diff>
--- a/backend-templates/box-to-microsoft-standard.docx
+++ b/backend-templates/box-to-microsoft-standard.docx
@@ -371,6 +371,108 @@
                 <w:sz w:val="19"/>
               </w:rPr>
               <w:t>}}</w:t>
+            </w:r>
+          </w:p>
+        </w:tc>
+      </w:tr>
+      <w:tr>
+        <w:trPr>
+          <w:jc w:val="center"/>
+        </w:trPr>
+        <w:tc>
+          <w:tcPr>
+            <w:tcW w:w="3822" w:type="dxa"/>
+          </w:tcPr>
+          <w:p>
+            <w:proofErr w:type="spellStart"/>
+            <w:r>
+              <w:t>Managed Migration Service</w:t>
+            </w:r>
+            <w:proofErr w:type="spellEnd"/>
+            <w:r>
+              <w:t xml:space="preserve"/>
+            </w:r>
+          </w:p>
+        </w:tc>
+        <w:tc>
+          <w:tcPr>
+            <w:tcW w:w="4415" w:type="dxa"/>
+          </w:tcPr>
+          <w:p>
+            <w:r>
+              <w:t>Managed Migration | Assigned Project Manager | Pre-Migration Analysis | During Migration Consulting | Post-Migration Support and Data Reconciliation Support | End-to End Migration Assistance with 24*7 Premium Support</w:t>
+            </w:r>
+            <w:r>
+              <w:t xml:space="preserve"/>
+            </w:r>
+            <w:r>
+              <w:t/>
+            </w:r>
+            <w:r>
+              <w:t xml:space="preserve"/>
+            </w:r>
+            <w:r>
+              <w:t/>
+            </w:r>
+          </w:p>
+          <w:p>
+            <w:r>
+              <w:t/>
+            </w:r>
+          </w:p>
+          <w:p>
+            <w:r>
+              <w:t/>
+            </w:r>
+            <w:proofErr w:type="spellStart"/>
+            <w:r>
+              <w:t/>
+            </w:r>
+            <w:proofErr w:type="spellEnd"/>
+            <w:r>
+              <w:t/>
+            </w:r>
+            <w:proofErr w:type="spellStart"/>
+            <w:r>
+              <w:t/>
+            </w:r>
+            <w:proofErr w:type="spellEnd"/>
+            <w:r>
+              <w:t/>
+            </w:r>
+          </w:p>
+          <w:p/>
+        </w:tc>
+        <w:tc>
+          <w:tcPr>
+            <w:tcW w:w="2459" w:type="dxa"/>
+          </w:tcPr>
+          <w:p>
+            <w:pPr>
+              <w:jc w:val="center"/>
+            </w:pPr>
+            <w:r>
+              <w:rPr>
+                <w:spacing w:val="-6"/>
+                <w:sz w:val="19"/>
+              </w:rPr>
+              <w:t>{{price_migration}}</w:t>
+            </w:r>
+            <w:proofErr w:type="spellStart"/>
+            <w:r>
+              <w:rPr>
+                <w:spacing w:val="-6"/>
+                <w:sz w:val="19"/>
+              </w:rPr>
+              <w:t/>
+            </w:r>
+            <w:proofErr w:type="spellEnd"/>
+            <w:r>
+              <w:rPr>
+                <w:spacing w:val="-4"/>
+                <w:sz w:val="19"/>
+              </w:rPr>
+              <w:t/>
             </w:r>
           </w:p>
         </w:tc>

</xml_diff>